<commit_message>
fix(generator): los sub-fase matching bug op met expliciete Regex voor actiecodes
- Vervang p.Contains((ph.Number * 10).ToString()) door Regex-matching op \b\d{3,4}\b

- Deelt de gevonden actiecode door 100 om de exacte fase-index te bepalen, wat substring-overeenkomsten (bijv. 20 in 1204) voorkomt

- Verwijdert de nu overbodige en ongebruikte seenSpecialAction flag uit de ParseChecklijst methode
</commit_message>
<xml_diff>
--- a/IssueTracker_Stappenplan.docx
+++ b/IssueTracker_Stappenplan.docx
@@ -29,7 +29,7 @@
           <w:i/>
           <w:color w:val="595959"/>
         </w:rPr>
-        <w:t>Gegenereerd op: 21-06-2026 21:41:28 | Status: Actief</w:t>
+        <w:t>Gegenereerd op: 21-06-2026 21:45:16 | Status: Actief</w:t>
       </w:r>
     </w:p>
     <w:p>
@@ -2904,6 +2904,26 @@
           <w:color w:val="000000"/>
         </w:rPr>
         <w:t>1. Jira-uitvoerder is medewerker</w:t>
+      </w:r>
+    </w:p>
+    <w:p>
+      <w:pPr>
+        <w:spacing w:after="60"/>
+        <w:ind w:left="720" w:hanging="360"/>
+      </w:pPr>
+      <w:r>
+        <w:rPr>
+          <w:rFonts w:ascii="Segoe UI" w:hAnsi="Segoe UI"/>
+          <w:sz w:val="22"/>
+        </w:rPr>
+        <w:t>☐  </w:t>
+      </w:r>
+      <w:r>
+        <w:rPr>
+          <w:rFonts w:ascii="Segoe UI" w:hAnsi="Segoe UI"/>
+          <w:sz w:val="22"/>
+        </w:rPr>
+        <w:t>1. Meldplicht indien Jira-uitvoerder NIET medewerker is</w:t>
       </w:r>
     </w:p>
     <w:p>

</xml_diff>